<commit_message>
Day5-Researcher: guard core AI call against failure, add project.md
InvokePromptAsync (the grounded search call) was unguarded - a bad key,
rate limit, or connectivity blip would crash the whole program with a
raw stack trace. Wraps it in try/catch matching the pattern already
used in Day1/Day2. Syncs the docx's Complete Code listing and replaces
missing.md with project.md.
</commit_message>
<xml_diff>
--- a/Day5-Researcher.docx
+++ b/Day5-Researcher.docx
@@ -1075,96 +1075,272 @@
           <w:rFonts w:ascii="Consolas" w:hAnsi="Consolas"/>
           <w:sz w:val="19"/>
         </w:rPr>
-        <w:t xml:space="preserve">            // Step 4: Execute the prompt</w:t>
-      </w:r>
-    </w:p>
-    <w:p>
-      <w:pPr>
-        <w:pStyle w:val="NoSpacing"/>
-        <w:rPr>
-          <w:rFonts w:ascii="Consolas" w:hAnsi="Consolas"/>
-          <w:sz w:val="19"/>
-        </w:rPr>
-      </w:pPr>
-      <w:r>
-        <w:rPr>
-          <w:rFonts w:ascii="Consolas" w:hAnsi="Consolas"/>
-          <w:sz w:val="19"/>
-        </w:rPr>
-        <w:t xml:space="preserve">            var result = await kernel.InvokePromptAsync(prompt, arguments);</w:t>
-      </w:r>
-    </w:p>
-    <w:p>
-      <w:pPr>
-        <w:pStyle w:val="NoSpacing"/>
-        <w:rPr>
-          <w:rFonts w:ascii="Consolas" w:hAnsi="Consolas"/>
-          <w:sz w:val="19"/>
-        </w:rPr>
-      </w:pPr>
-    </w:p>
-    <w:p>
-      <w:pPr>
-        <w:pStyle w:val="NoSpacing"/>
-        <w:rPr>
-          <w:rFonts w:ascii="Consolas" w:hAnsi="Consolas"/>
-          <w:sz w:val="19"/>
-        </w:rPr>
-      </w:pPr>
-      <w:r>
-        <w:rPr>
-          <w:rFonts w:ascii="Consolas" w:hAnsi="Consolas"/>
-          <w:sz w:val="19"/>
-        </w:rPr>
-        <w:t xml:space="preserve">            // Step 5: Display the final result</w:t>
-      </w:r>
-    </w:p>
-    <w:p>
-      <w:pPr>
-        <w:pStyle w:val="NoSpacing"/>
-        <w:rPr>
-          <w:rFonts w:ascii="Consolas" w:hAnsi="Consolas"/>
-          <w:sz w:val="19"/>
-        </w:rPr>
-      </w:pPr>
-      <w:r>
-        <w:rPr>
-          <w:rFonts w:ascii="Consolas" w:hAnsi="Consolas"/>
-          <w:sz w:val="19"/>
-        </w:rPr>
-        <w:t xml:space="preserve">            Console.WriteLine("--- AI RESEARCH REPORT ---");</w:t>
-      </w:r>
-    </w:p>
-    <w:p>
-      <w:pPr>
-        <w:pStyle w:val="NoSpacing"/>
-        <w:rPr>
-          <w:rFonts w:ascii="Consolas" w:hAnsi="Consolas"/>
-          <w:sz w:val="19"/>
-        </w:rPr>
-      </w:pPr>
-      <w:r>
-        <w:rPr>
-          <w:rFonts w:ascii="Consolas" w:hAnsi="Consolas"/>
-          <w:sz w:val="19"/>
-        </w:rPr>
-        <w:t xml:space="preserve">            Console.WriteLine(result.ToString().Trim());</w:t>
-      </w:r>
-    </w:p>
-    <w:p>
-      <w:pPr>
-        <w:pStyle w:val="NoSpacing"/>
-        <w:rPr>
-          <w:rFonts w:ascii="Consolas" w:hAnsi="Consolas"/>
-          <w:sz w:val="19"/>
-        </w:rPr>
-      </w:pPr>
-      <w:r>
-        <w:rPr>
-          <w:rFonts w:ascii="Consolas" w:hAnsi="Consolas"/>
-          <w:sz w:val="19"/>
-        </w:rPr>
-        <w:t xml:space="preserve">            Console.WriteLine("--------------------------");</w:t>
+        <w:t xml:space="preserve">            // Step 4: Execute the prompt. Wrapped in try/catch because this is</w:t>
+      </w:r>
+    </w:p>
+    <w:p>
+      <w:pPr>
+        <w:pStyle w:val="NoSpacing"/>
+        <w:rPr>
+          <w:rFonts w:ascii="Consolas" w:hAnsi="Consolas"/>
+          <w:sz w:val="19"/>
+        </w:rPr>
+      </w:pPr>
+      <w:r>
+        <w:rPr>
+          <w:rFonts w:ascii="Consolas" w:hAnsi="Consolas"/>
+          <w:sz w:val="19"/>
+        </w:rPr>
+        <w:t xml:space="preserve">            // the network call to the model - grounding adds an extra live</w:t>
+      </w:r>
+    </w:p>
+    <w:p>
+      <w:pPr>
+        <w:pStyle w:val="NoSpacing"/>
+        <w:rPr>
+          <w:rFonts w:ascii="Consolas" w:hAnsi="Consolas"/>
+          <w:sz w:val="19"/>
+        </w:rPr>
+      </w:pPr>
+      <w:r>
+        <w:rPr>
+          <w:rFonts w:ascii="Consolas" w:hAnsi="Consolas"/>
+          <w:sz w:val="19"/>
+        </w:rPr>
+        <w:t xml:space="preserve">            // search hop beyond the base chat call, so a bad key, rate limit,</w:t>
+      </w:r>
+    </w:p>
+    <w:p>
+      <w:pPr>
+        <w:pStyle w:val="NoSpacing"/>
+        <w:rPr>
+          <w:rFonts w:ascii="Consolas" w:hAnsi="Consolas"/>
+          <w:sz w:val="19"/>
+        </w:rPr>
+      </w:pPr>
+      <w:r>
+        <w:rPr>
+          <w:rFonts w:ascii="Consolas" w:hAnsi="Consolas"/>
+          <w:sz w:val="19"/>
+        </w:rPr>
+        <w:t xml:space="preserve">            // or connectivity blip here would otherwise crash the whole</w:t>
+      </w:r>
+    </w:p>
+    <w:p>
+      <w:pPr>
+        <w:pStyle w:val="NoSpacing"/>
+        <w:rPr>
+          <w:rFonts w:ascii="Consolas" w:hAnsi="Consolas"/>
+          <w:sz w:val="19"/>
+        </w:rPr>
+      </w:pPr>
+      <w:r>
+        <w:rPr>
+          <w:rFonts w:ascii="Consolas" w:hAnsi="Consolas"/>
+          <w:sz w:val="19"/>
+        </w:rPr>
+        <w:t xml:space="preserve">            // program with a raw stack trace instead of a readable message.</w:t>
+      </w:r>
+    </w:p>
+    <w:p>
+      <w:pPr>
+        <w:pStyle w:val="NoSpacing"/>
+        <w:rPr>
+          <w:rFonts w:ascii="Consolas" w:hAnsi="Consolas"/>
+          <w:sz w:val="19"/>
+        </w:rPr>
+      </w:pPr>
+      <w:r>
+        <w:rPr>
+          <w:rFonts w:ascii="Consolas" w:hAnsi="Consolas"/>
+          <w:sz w:val="19"/>
+        </w:rPr>
+        <w:t xml:space="preserve">            try</w:t>
+      </w:r>
+    </w:p>
+    <w:p>
+      <w:pPr>
+        <w:pStyle w:val="NoSpacing"/>
+        <w:rPr>
+          <w:rFonts w:ascii="Consolas" w:hAnsi="Consolas"/>
+          <w:sz w:val="19"/>
+        </w:rPr>
+      </w:pPr>
+      <w:r>
+        <w:rPr>
+          <w:rFonts w:ascii="Consolas" w:hAnsi="Consolas"/>
+          <w:sz w:val="19"/>
+        </w:rPr>
+        <w:t xml:space="preserve">            {</w:t>
+      </w:r>
+    </w:p>
+    <w:p>
+      <w:pPr>
+        <w:pStyle w:val="NoSpacing"/>
+        <w:rPr>
+          <w:rFonts w:ascii="Consolas" w:hAnsi="Consolas"/>
+          <w:sz w:val="19"/>
+        </w:rPr>
+      </w:pPr>
+      <w:r>
+        <w:rPr>
+          <w:rFonts w:ascii="Consolas" w:hAnsi="Consolas"/>
+          <w:sz w:val="19"/>
+        </w:rPr>
+        <w:t xml:space="preserve">                var result = await kernel.InvokePromptAsync(prompt, arguments);</w:t>
+      </w:r>
+    </w:p>
+    <w:p>
+      <w:pPr>
+        <w:pStyle w:val="NoSpacing"/>
+        <w:rPr>
+          <w:rFonts w:ascii="Consolas" w:hAnsi="Consolas"/>
+          <w:sz w:val="19"/>
+        </w:rPr>
+      </w:pPr>
+    </w:p>
+    <w:p>
+      <w:pPr>
+        <w:pStyle w:val="NoSpacing"/>
+        <w:rPr>
+          <w:rFonts w:ascii="Consolas" w:hAnsi="Consolas"/>
+          <w:sz w:val="19"/>
+        </w:rPr>
+      </w:pPr>
+      <w:r>
+        <w:rPr>
+          <w:rFonts w:ascii="Consolas" w:hAnsi="Consolas"/>
+          <w:sz w:val="19"/>
+        </w:rPr>
+        <w:t xml:space="preserve">                // Step 5: Display the final result</w:t>
+      </w:r>
+    </w:p>
+    <w:p>
+      <w:pPr>
+        <w:pStyle w:val="NoSpacing"/>
+        <w:rPr>
+          <w:rFonts w:ascii="Consolas" w:hAnsi="Consolas"/>
+          <w:sz w:val="19"/>
+        </w:rPr>
+      </w:pPr>
+      <w:r>
+        <w:rPr>
+          <w:rFonts w:ascii="Consolas" w:hAnsi="Consolas"/>
+          <w:sz w:val="19"/>
+        </w:rPr>
+        <w:t xml:space="preserve">                Console.WriteLine("--- AI RESEARCH REPORT ---");</w:t>
+      </w:r>
+    </w:p>
+    <w:p>
+      <w:pPr>
+        <w:pStyle w:val="NoSpacing"/>
+        <w:rPr>
+          <w:rFonts w:ascii="Consolas" w:hAnsi="Consolas"/>
+          <w:sz w:val="19"/>
+        </w:rPr>
+      </w:pPr>
+      <w:r>
+        <w:rPr>
+          <w:rFonts w:ascii="Consolas" w:hAnsi="Consolas"/>
+          <w:sz w:val="19"/>
+        </w:rPr>
+        <w:t xml:space="preserve">                Console.WriteLine(result.ToString().Trim());</w:t>
+      </w:r>
+    </w:p>
+    <w:p>
+      <w:pPr>
+        <w:pStyle w:val="NoSpacing"/>
+        <w:rPr>
+          <w:rFonts w:ascii="Consolas" w:hAnsi="Consolas"/>
+          <w:sz w:val="19"/>
+        </w:rPr>
+      </w:pPr>
+      <w:r>
+        <w:rPr>
+          <w:rFonts w:ascii="Consolas" w:hAnsi="Consolas"/>
+          <w:sz w:val="19"/>
+        </w:rPr>
+        <w:t xml:space="preserve">                Console.WriteLine("--------------------------");</w:t>
+      </w:r>
+    </w:p>
+    <w:p>
+      <w:pPr>
+        <w:pStyle w:val="NoSpacing"/>
+        <w:rPr>
+          <w:rFonts w:ascii="Consolas" w:hAnsi="Consolas"/>
+          <w:sz w:val="19"/>
+        </w:rPr>
+      </w:pPr>
+      <w:r>
+        <w:rPr>
+          <w:rFonts w:ascii="Consolas" w:hAnsi="Consolas"/>
+          <w:sz w:val="19"/>
+        </w:rPr>
+        <w:t xml:space="preserve">            }</w:t>
+      </w:r>
+    </w:p>
+    <w:p>
+      <w:pPr>
+        <w:pStyle w:val="NoSpacing"/>
+        <w:rPr>
+          <w:rFonts w:ascii="Consolas" w:hAnsi="Consolas"/>
+          <w:sz w:val="19"/>
+        </w:rPr>
+      </w:pPr>
+      <w:r>
+        <w:rPr>
+          <w:rFonts w:ascii="Consolas" w:hAnsi="Consolas"/>
+          <w:sz w:val="19"/>
+        </w:rPr>
+        <w:t xml:space="preserve">            catch (Exception ex)</w:t>
+      </w:r>
+    </w:p>
+    <w:p>
+      <w:pPr>
+        <w:pStyle w:val="NoSpacing"/>
+        <w:rPr>
+          <w:rFonts w:ascii="Consolas" w:hAnsi="Consolas"/>
+          <w:sz w:val="19"/>
+        </w:rPr>
+      </w:pPr>
+      <w:r>
+        <w:rPr>
+          <w:rFonts w:ascii="Consolas" w:hAnsi="Consolas"/>
+          <w:sz w:val="19"/>
+        </w:rPr>
+        <w:t xml:space="preserve">            {</w:t>
+      </w:r>
+    </w:p>
+    <w:p>
+      <w:pPr>
+        <w:pStyle w:val="NoSpacing"/>
+        <w:rPr>
+          <w:rFonts w:ascii="Consolas" w:hAnsi="Consolas"/>
+          <w:sz w:val="19"/>
+        </w:rPr>
+      </w:pPr>
+      <w:r>
+        <w:rPr>
+          <w:rFonts w:ascii="Consolas" w:hAnsi="Consolas"/>
+          <w:sz w:val="19"/>
+        </w:rPr>
+        <w:t xml:space="preserve">                Console.WriteLine($"Research request failed: {ex.Message}");</w:t>
+      </w:r>
+    </w:p>
+    <w:p>
+      <w:pPr>
+        <w:pStyle w:val="NoSpacing"/>
+        <w:rPr>
+          <w:rFonts w:ascii="Consolas" w:hAnsi="Consolas"/>
+          <w:sz w:val="19"/>
+        </w:rPr>
+      </w:pPr>
+      <w:r>
+        <w:rPr>
+          <w:rFonts w:ascii="Consolas" w:hAnsi="Consolas"/>
+          <w:sz w:val="19"/>
+        </w:rPr>
+        <w:t xml:space="preserve">            }</w:t>
       </w:r>
     </w:p>
     <w:p>
@@ -1221,6 +1397,7 @@
         <w:pStyle w:val="Heading2"/>
       </w:pPr>
       <w:r>
+        <w:lastRenderedPageBreak/>
         <w:t>5. Code Walkthrough &amp; Explanations</w:t>
       </w:r>
     </w:p>
@@ -1232,11 +1409,7 @@
         <w:t>Step 1: A Deliberately "Empty" Kernel.</w:t>
       </w:r>
       <w:r>
-        <w:t xml:space="preserve"> The kernel setup follows the now-familiar pattern, but the comment `// Notice: We do NOT add any Custom Search Plugins to the builder!` is the whole point of the lesson. Unlike Day 4's `MathPlugin` or Day 6's `FileSystemPlugin`, </w:t>
-      </w:r>
-      <w:r>
-        <w:lastRenderedPageBreak/>
-        <w:t>there is no `builder.Plugins.AddFromType&lt;T&gt;()` or `AddFromObject()` call anywhere in this file. The kernel that gets built genuinely has zero registered plugins — yet the program will still be able to search the live internet. That capability has to come from somewhere other than Semantic Kernel's plugin system.</w:t>
+        <w:t xml:space="preserve"> The kernel setup follows the now-familiar pattern, but the comment `// Notice: We do NOT add any Custom Search Plugins to the builder!` is the whole point of the lesson. Unlike Day 4's `MathPlugin` or Day 6's `FileSystemPlugin`, there is no `builder.Plugins.AddFromType&lt;T&gt;()` or `AddFromObject()` call anywhere in this file. The kernel that gets built genuinely has zero registered plugins — yet the program will still be able to search the live internet. That capability has to come from somewhere other than Semantic Kernel's plugin system.</w:t>
       </w:r>
     </w:p>
     <w:p/>

</xml_diff>